<commit_message>
Fix T4a duplicate sends and T19 leap year edge case
- T4a: add lembrete_enviado = false to WHERE clause — prevents 30min trigger
  from firing multiple times on same booking; update note to set = true after send
- T19: replace date arithmetic with EXTRACT(MONTH/DAY) + <= 1 year check —
  handles 29/Feb cadastro dates in leap years that would never match
- Add lembrete_enviado field to agendamentos table (DB section + migration SQL)
- Add lembrete_enviado to ALTER TABLE agendamentos in migration SQL
- Update Bloco 2 info box to document the lembrete_enviado guard

https://claude.ai/code/session_01MwAtLHVWNS4Q7Z82CFpY2N
</commit_message>
<xml_diff>
--- a/FollowUp_Nicolas_v3.docx
+++ b/FollowUp_Nicolas_v3.docx
@@ -3710,6 +3710,10 @@
               <w:t xml:space="preserve">  ⏱️  T4a (30min): Schedule node rodando a cada 30 min — não usar Schedule diário.</w:t>
               <w:br/>
               <w:t xml:space="preserve">  T4b (D+1): Schedule diário 09h00 — disparar se ainda sem pagamento na manhã seguinte.</w:t>
+              <w:br/>
+              <w:t xml:space="preserve">  ⚠️  Campo lembrete_enviado (boolean, DEFAULT false) na tabela agendamentos evita duplicatas.</w:t>
+              <w:br/>
+              <w:t xml:space="preserve">     T4a: adicionar AND lembrete_enviado = false no WHERE → após envio setar lembrete_enviado = true.</w:t>
             </w:r>
           </w:p>
         </w:tc>
@@ -5822,7 +5826,13 @@
           <w:color w:val="1E2A3A"/>
           <w:sz w:val="16"/>
         </w:rPr>
-        <w:t>data_cadastro = CURRENT_DATE - INTERVAL '1 year'  AND  opt_out = false</w:t>
+        <w:t>EXTRACT(MONTH FROM data_cadastro) = EXTRACT(MONTH FROM CURRENT_DATE)</w:t>
+        <w:br/>
+        <w:t xml:space="preserve">  AND EXTRACT(DAY FROM data_cadastro) = EXTRACT(DAY FROM CURRENT_DATE)</w:t>
+        <w:br/>
+        <w:t xml:space="preserve">  AND data_cadastro &lt;= CURRENT_DATE - INTERVAL '1 year'</w:t>
+        <w:br/>
+        <w:t xml:space="preserve">  AND opt_out = false</w:t>
       </w:r>
     </w:p>
     <w:p>
@@ -7210,6 +7220,195 @@
     </w:p>
     <w:p>
       <w:pPr>
+        <w:spacing w:before="0" w:after="0" w:line="160" w:lineRule="exact"/>
+      </w:pPr>
+    </w:p>
+    <w:p>
+      <w:pPr>
+        <w:spacing w:before="0" w:after="80"/>
+      </w:pPr>
+      <w:r>
+        <w:rPr>
+          <w:rFonts w:ascii="Calibri" w:hAnsi="Calibri"/>
+          <w:b w:val="0"/>
+          <w:i/>
+          <w:color w:val="1E2A3A"/>
+          <w:sz w:val="18"/>
+        </w:rPr>
+        <w:t xml:space="preserve">  Tabela: agendamentos  |  Adicionar campo abaixo para controle de duplicatas no Bloco 2.</w:t>
+      </w:r>
+    </w:p>
+    <w:tbl>
+      <w:tblPr>
+        <w:tblW w:type="auto" w:w="0"/>
+        <w:jc w:val="center"/>
+        <w:tblLook w:firstColumn="1" w:firstRow="1" w:lastColumn="0" w:lastRow="0" w:noHBand="0" w:noVBand="1" w:val="04A0"/>
+      </w:tblPr>
+      <w:tblGrid>
+        <w:gridCol w:w="3118"/>
+        <w:gridCol w:w="1417"/>
+        <w:gridCol w:w="5102"/>
+      </w:tblGrid>
+      <w:tr>
+        <w:tc>
+          <w:tcPr>
+            <w:tcW w:type="dxa" w:w="3135"/>
+            <w:shd w:val="clear" w:color="auto" w:fill="1E2A3A"/>
+          </w:tcPr>
+          <w:p>
+            <w:pPr>
+              <w:spacing w:before="60" w:after="20"/>
+            </w:pPr>
+            <w:r>
+              <w:rPr>
+                <w:rFonts w:ascii="Calibri" w:hAnsi="Calibri"/>
+                <w:b/>
+                <w:i w:val="0"/>
+                <w:color w:val="FFFFFF"/>
+                <w:sz w:val="18"/>
+              </w:rPr>
+              <w:t xml:space="preserve">  Campo</w:t>
+            </w:r>
+          </w:p>
+        </w:tc>
+        <w:tc>
+          <w:tcPr>
+            <w:tcW w:type="dxa" w:w="3135"/>
+            <w:shd w:val="clear" w:color="auto" w:fill="1E2A3A"/>
+          </w:tcPr>
+          <w:p>
+            <w:pPr>
+              <w:spacing w:before="60" w:after="20"/>
+            </w:pPr>
+            <w:r>
+              <w:rPr>
+                <w:rFonts w:ascii="Calibri" w:hAnsi="Calibri"/>
+                <w:b/>
+                <w:i w:val="0"/>
+                <w:color w:val="FFFFFF"/>
+                <w:sz w:val="18"/>
+              </w:rPr>
+              <w:t xml:space="preserve">  Tipo</w:t>
+            </w:r>
+          </w:p>
+        </w:tc>
+        <w:tc>
+          <w:tcPr>
+            <w:tcW w:type="dxa" w:w="3135"/>
+            <w:shd w:val="clear" w:color="auto" w:fill="1E2A3A"/>
+          </w:tcPr>
+          <w:p>
+            <w:pPr>
+              <w:spacing w:before="60" w:after="20"/>
+            </w:pPr>
+            <w:r>
+              <w:rPr>
+                <w:rFonts w:ascii="Calibri" w:hAnsi="Calibri"/>
+                <w:b/>
+                <w:i w:val="0"/>
+                <w:color w:val="FFFFFF"/>
+                <w:sz w:val="18"/>
+              </w:rPr>
+              <w:t xml:space="preserve">  Descrição</w:t>
+            </w:r>
+          </w:p>
+        </w:tc>
+      </w:tr>
+    </w:tbl>
+    <w:tbl>
+      <w:tblPr>
+        <w:tblW w:type="auto" w:w="0"/>
+        <w:jc w:val="center"/>
+        <w:tblLook w:firstColumn="1" w:firstRow="1" w:lastColumn="0" w:lastRow="0" w:noHBand="0" w:noVBand="1" w:val="04A0"/>
+      </w:tblPr>
+      <w:tblGrid>
+        <w:gridCol w:w="3118"/>
+        <w:gridCol w:w="1417"/>
+        <w:gridCol w:w="5102"/>
+      </w:tblGrid>
+      <w:tr>
+        <w:tc>
+          <w:tcPr>
+            <w:tcW w:type="dxa" w:w="3135"/>
+            <w:shd w:val="clear" w:color="auto" w:fill="F8F9FA"/>
+          </w:tcPr>
+          <w:p>
+            <w:pPr>
+              <w:spacing w:before="60" w:after="20"/>
+            </w:pPr>
+            <w:r>
+              <w:rPr>
+                <w:rFonts w:ascii="Courier New" w:hAnsi="Courier New"/>
+                <w:b w:val="0"/>
+                <w:i w:val="0"/>
+                <w:color w:val="1E2A3A"/>
+                <w:sz w:val="18"/>
+              </w:rPr>
+              <w:t xml:space="preserve">  lembrete_enviado</w:t>
+            </w:r>
+          </w:p>
+        </w:tc>
+        <w:tc>
+          <w:tcPr>
+            <w:tcW w:type="dxa" w:w="3135"/>
+            <w:shd w:val="clear" w:color="auto" w:fill="F8F9FA"/>
+          </w:tcPr>
+          <w:p>
+            <w:pPr>
+              <w:spacing w:before="60" w:after="20"/>
+            </w:pPr>
+            <w:r>
+              <w:rPr>
+                <w:rFonts w:ascii="Calibri" w:hAnsi="Calibri"/>
+                <w:b w:val="0"/>
+                <w:i w:val="0"/>
+                <w:color w:val="1E2A3A"/>
+                <w:sz w:val="18"/>
+              </w:rPr>
+              <w:t xml:space="preserve">  boolean</w:t>
+            </w:r>
+          </w:p>
+        </w:tc>
+        <w:tc>
+          <w:tcPr>
+            <w:tcW w:type="dxa" w:w="3135"/>
+            <w:shd w:val="clear" w:color="auto" w:fill="F8F9FA"/>
+          </w:tcPr>
+          <w:p>
+            <w:pPr>
+              <w:spacing w:before="60" w:after="20"/>
+            </w:pPr>
+            <w:r>
+              <w:rPr>
+                <w:rFonts w:ascii="Calibri" w:hAnsi="Calibri"/>
+                <w:b w:val="0"/>
+                <w:i w:val="0"/>
+                <w:color w:val="1E2A3A"/>
+                <w:sz w:val="18"/>
+              </w:rPr>
+              <w:t xml:space="preserve">  Impede que T4a dispare mais de uma vez para o mesmo agendamento.</w:t>
+            </w:r>
+          </w:p>
+          <w:p>
+            <w:pPr>
+              <w:spacing w:before="0" w:after="60"/>
+            </w:pPr>
+            <w:r>
+              <w:rPr>
+                <w:rFonts w:ascii="Calibri" w:hAnsi="Calibri"/>
+                <w:b w:val="0"/>
+                <w:i/>
+                <w:color w:val="B36B00"/>
+                <w:sz w:val="15"/>
+              </w:rPr>
+              <w:t xml:space="preserve">  → DEFAULT false  |  Setar true após envio do lembrete 30min (T4a)</w:t>
+            </w:r>
+          </w:p>
+        </w:tc>
+      </w:tr>
+    </w:tbl>
+    <w:p>
+      <w:pPr>
         <w:spacing w:before="0" w:after="0" w:line="280" w:lineRule="exact"/>
       </w:pPr>
     </w:p>
@@ -7646,7 +7845,7 @@
                 <w:color w:val="FFD054"/>
                 <w:sz w:val="14"/>
               </w:rPr>
-              <w:t xml:space="preserve">  ⚠️ Schedule: cada 30min (não diário!)</w:t>
+              <w:t xml:space="preserve">  ⚠️ Após envio: setar lembrete_enviado = true na agendamentos</w:t>
             </w:r>
           </w:p>
         </w:tc>
@@ -7674,6 +7873,8 @@
               <w:t>WHERE a.criado_em &lt;= NOW() - INTERVAL '30 min'</w:t>
               <w:br/>
               <w:t>AND a.pagamento_confirmado = false</w:t>
+              <w:br/>
+              <w:t>AND a.lembrete_enviado = false</w:t>
               <w:br/>
               <w:t>AND c.opt_out = false</w:t>
             </w:r>
@@ -9165,6 +9366,21 @@
               <w:t xml:space="preserve">  T19 — Bloco 8  1 ano REMMED</w:t>
             </w:r>
           </w:p>
+          <w:p>
+            <w:pPr>
+              <w:spacing w:before="0" w:after="60"/>
+            </w:pPr>
+            <w:r>
+              <w:rPr>
+                <w:rFonts w:ascii="Calibri" w:hAnsi="Calibri"/>
+                <w:b w:val="0"/>
+                <w:i/>
+                <w:color w:val="FFD054"/>
+                <w:sz w:val="14"/>
+              </w:rPr>
+              <w:t xml:space="preserve">  ⚠️ Blindado contra 29/fev anos bissextos</w:t>
+            </w:r>
+          </w:p>
         </w:tc>
         <w:tc>
           <w:tcPr>
@@ -9185,7 +9401,11 @@
               </w:rPr>
               <w:t xml:space="preserve">  SELECT * FROM clientes</w:t>
               <w:br/>
-              <w:t>WHERE data_cadastro = CURRENT_DATE - INTERVAL '1 year'</w:t>
+              <w:t>WHERE EXTRACT(MONTH FROM data_cadastro) = EXTRACT(MONTH FROM CURRENT_DATE)</w:t>
+              <w:br/>
+              <w:t>AND EXTRACT(DAY FROM data_cadastro) = EXTRACT(DAY FROM CURRENT_DATE)</w:t>
+              <w:br/>
+              <w:t>AND data_cadastro &lt;= CURRENT_DATE - INTERVAL '1 year'</w:t>
               <w:br/>
               <w:t>AND opt_out = false</w:t>
             </w:r>
@@ -9962,6 +10182,13 @@
               <w:t>CREATE INDEX IF NOT EXISTS idx_clientes_opt_out            ON clientes(opt_out);</w:t>
               <w:br/>
               <w:t>CREATE INDEX IF NOT EXISTS idx_clientes_status             ON clientes(status_paciente);</w:t>
+              <w:br/>
+              <w:br/>
+              <w:t>-- Campo na tabela agendamentos (evita duplicatas T4a)</w:t>
+              <w:br/>
+              <w:t>ALTER TABLE agendamentos</w:t>
+              <w:br/>
+              <w:t xml:space="preserve">  ADD COLUMN IF NOT EXISTS lembrete_enviado boolean DEFAULT false NOT NULL;</w:t>
               <w:br/>
               <w:br/>
               <w:t>-- Tabela de log de erros de envio</w:t>

</xml_diff>